<commit_message>
fix: refine resume wording and contact links
</commit_message>
<xml_diff>
--- a/public/Michael_Grier_Resume.docx
+++ b/public/Michael_Grier_Resume.docx
@@ -21,7 +21,6 @@
     <w:p>
       <w:pPr>
         <w:pStyle w:val="Contact"/>
-        <w:spacing w:after="240"/>
       </w:pPr>
       <w:r>
         <w:t xml:space="preserve">Calgary, AB  |  </w:t>
@@ -42,8 +41,25 @@
       </w:r>
     </w:p>
     <w:p>
+      <w:pPr>
+        <w:pStyle w:val="Contact"/>
+        <w:spacing w:after="240"/>
+      </w:pPr>
       <w:r>
-        <w:t>Full-stack software developer with five years of experience at TransAlta, building renewable-energy reporting tools and business process automation. Co-led AthenaOS and maintained GenOS across React interfaces, APIs, databases, and Azure infrastructure. Independent work includes an ecommerce platform, a native mobile app, and browser-based developer tooling.</w:t>
+        <w:t xml:space="preserve">GitHub: </w:t>
+      </w:r>
+      <w:hyperlink r:id="rId10">
+        <w:r>
+          <w:rPr>
+            <w:color w:val="0078BF"/>
+          </w:rPr>
+          <w:t>github.com/michael-grier</w:t>
+        </w:r>
+      </w:hyperlink>
+    </w:p>
+    <w:p>
+      <w:r>
+        <w:t>Full-stack software developer with five years at TransAlta building renewable-energy reporting tools and business process automation. Co-led a reporting and data-governance platform and maintained a wind, solar, and hydro operations app, working across React interfaces, APIs, databases, and Azure infrastructure. Independent projects include ecommerce, a native mobile app, and browser-based developer tools.</w:t>
       </w:r>
     </w:p>
     <w:p>
@@ -142,7 +158,7 @@
         <w:pStyle w:val="ListBullet"/>
       </w:pPr>
       <w:r>
-        <w:t>Migrated event data from REST to GraphQL and replaced a 1,717-line shared React component with focused wind, solar, and hydro modules.</w:t>
+        <w:t>Migrated event data from REST to GraphQL and replaced a 1,700-line shared React component with focused wind, solar, and hydro modules.</w:t>
       </w:r>
     </w:p>
     <w:p>
@@ -200,7 +216,7 @@
     </w:p>
     <w:p>
       <w:r>
-        <w:t>Led frontend design and development for a Django web project, supported Unity mobile game development, and advised clients on software architecture.</w:t>
+        <w:t>Led frontend design and development for a Django web project and supported Unity mobile game development.</w:t>
       </w:r>
     </w:p>
     <w:p>
@@ -208,7 +224,7 @@
         <w:pStyle w:val="Heading2"/>
       </w:pPr>
       <w:r>
-        <w:t>Front End Web Developer Intern</w:t>
+        <w:t>Frontend Web Developer Intern</w:t>
       </w:r>
     </w:p>
     <w:p>
@@ -242,42 +258,6 @@
       </w:pPr>
       <w:r>
         <w:t>Independent development</w:t>
-      </w:r>
-    </w:p>
-    <w:p>
-      <w:pPr>
-        <w:pStyle w:val="Heading2"/>
-        <w:spacing w:before="240" w:after="40"/>
-      </w:pPr>
-      <w:hyperlink r:id="rId10">
-        <w:r>
-          <w:rPr>
-            <w:color w:val="0078BF"/>
-          </w:rPr>
-          <w:t>Fuckers Skateboards</w:t>
-        </w:r>
-      </w:hyperlink>
-    </w:p>
-    <w:p>
-      <w:pPr>
-        <w:pStyle w:val="Detail"/>
-        <w:spacing w:after="140"/>
-      </w:pPr>
-      <w:r>
-        <w:t>Ecommerce platform for skateboard goods</w:t>
-      </w:r>
-    </w:p>
-    <w:p>
-      <w:r>
-        <w:t>Built checkout with server-validated pricing and atomic inventory reservations, retry-safe payment processing, and order management. Added end-to-end tests for price tampering, duplicate payments, and stock release.</w:t>
-      </w:r>
-    </w:p>
-    <w:p>
-      <w:pPr>
-        <w:pStyle w:val="Detail"/>
-      </w:pPr>
-      <w:r>
-        <w:t>Next.js, Stripe, Neon PostgreSQL, Drizzle, Cloudflare R2, Playwright</w:t>
       </w:r>
     </w:p>
     <w:p>
@@ -322,6 +302,42 @@
         <w:spacing w:before="240" w:after="40"/>
       </w:pPr>
       <w:hyperlink r:id="rId12">
+        <w:r>
+          <w:rPr>
+            <w:color w:val="0078BF"/>
+          </w:rPr>
+          <w:t>Fuckers Skateboards</w:t>
+        </w:r>
+      </w:hyperlink>
+    </w:p>
+    <w:p>
+      <w:pPr>
+        <w:pStyle w:val="Detail"/>
+        <w:spacing w:after="140"/>
+      </w:pPr>
+      <w:r>
+        <w:t>Ecommerce platform for skateboard goods</w:t>
+      </w:r>
+    </w:p>
+    <w:p>
+      <w:r>
+        <w:t>Built checkout with server-validated pricing and atomic inventory reservations, retry-safe payment processing, and order management. Added end-to-end tests for price tampering, duplicate payments, and stock release.</w:t>
+      </w:r>
+    </w:p>
+    <w:p>
+      <w:pPr>
+        <w:pStyle w:val="Detail"/>
+      </w:pPr>
+      <w:r>
+        <w:t>Next.js, Stripe, Neon PostgreSQL, Drizzle, Cloudflare R2, Playwright</w:t>
+      </w:r>
+    </w:p>
+    <w:p>
+      <w:pPr>
+        <w:pStyle w:val="Heading2"/>
+        <w:spacing w:before="240" w:after="40"/>
+      </w:pPr>
+      <w:hyperlink r:id="rId13">
         <w:r>
           <w:rPr>
             <w:color w:val="0078BF"/>
@@ -416,7 +432,7 @@
         <w:t xml:space="preserve">Testing and tools: </w:t>
       </w:r>
       <w:r>
-        <w:t>Playwright, Vitest, Jest, React Testing Library, Git, Bun, Bash, Figma, Blue Prism</w:t>
+        <w:t>Playwright, Vitest, Jest, React Testing Library, Bun, Blue Prism</w:t>
       </w:r>
     </w:p>
     <w:p>
@@ -479,10 +495,10 @@
       </w:r>
     </w:p>
     <w:sectPr>
-      <w:headerReference w:type="default" r:id="rId13"/>
-      <w:headerReference w:type="first" r:id="rId14"/>
-      <w:footerReference w:type="first" r:id="rId15"/>
-      <w:footerReference w:type="default" r:id="rId16"/>
+      <w:headerReference w:type="default" r:id="rId14"/>
+      <w:headerReference w:type="first" r:id="rId15"/>
+      <w:footerReference w:type="first" r:id="rId16"/>
+      <w:footerReference w:type="default" r:id="rId17"/>
       <w:pgSz w:w="12240" w:h="15840"/>
       <w:pgMar w:top="691" w:right="893" w:bottom="691" w:left="893" w:header="317" w:footer="317" w:gutter="0"/>
       <w:cols w:space="720"/>

</xml_diff>

<commit_message>
fix: lead resume with descriptive ecommerce project
</commit_message>
<xml_diff>
--- a/public/Michael_Grier_Resume.docx
+++ b/public/Michael_Grier_Resume.docx
@@ -270,6 +270,42 @@
           <w:rPr>
             <w:color w:val="0078BF"/>
           </w:rPr>
+          <w:t>Skateboard Ecommerce Platform</w:t>
+        </w:r>
+      </w:hyperlink>
+    </w:p>
+    <w:p>
+      <w:pPr>
+        <w:pStyle w:val="Detail"/>
+        <w:spacing w:after="140"/>
+      </w:pPr>
+      <w:r>
+        <w:t>Checkout, inventory, and order management for an independent skateboard brand</w:t>
+      </w:r>
+    </w:p>
+    <w:p>
+      <w:r>
+        <w:t>Built checkout with server-validated pricing and atomic inventory reservations, retry-safe payment processing, and order management. Added end-to-end tests for price tampering, duplicate payments, and stock release.</w:t>
+      </w:r>
+    </w:p>
+    <w:p>
+      <w:pPr>
+        <w:pStyle w:val="Detail"/>
+      </w:pPr>
+      <w:r>
+        <w:t>Next.js, Stripe, Neon PostgreSQL, Drizzle, Cloudflare R2, Playwright</w:t>
+      </w:r>
+    </w:p>
+    <w:p>
+      <w:pPr>
+        <w:pStyle w:val="Heading2"/>
+        <w:spacing w:before="240" w:after="40"/>
+      </w:pPr>
+      <w:hyperlink r:id="rId12">
+        <w:r>
+          <w:rPr>
+            <w:color w:val="0078BF"/>
+          </w:rPr>
           <w:t>YYC Skate Spots</w:t>
         </w:r>
       </w:hyperlink>
@@ -294,42 +330,6 @@
       </w:pPr>
       <w:r>
         <w:t>React Native, Expo, Convex, Clerk, Google Maps, EAS</w:t>
-      </w:r>
-    </w:p>
-    <w:p>
-      <w:pPr>
-        <w:pStyle w:val="Heading2"/>
-        <w:spacing w:before="240" w:after="40"/>
-      </w:pPr>
-      <w:hyperlink r:id="rId12">
-        <w:r>
-          <w:rPr>
-            <w:color w:val="0078BF"/>
-          </w:rPr>
-          <w:t>Fuckers Skateboards</w:t>
-        </w:r>
-      </w:hyperlink>
-    </w:p>
-    <w:p>
-      <w:pPr>
-        <w:pStyle w:val="Detail"/>
-        <w:spacing w:after="140"/>
-      </w:pPr>
-      <w:r>
-        <w:t>Ecommerce platform for skateboard goods</w:t>
-      </w:r>
-    </w:p>
-    <w:p>
-      <w:r>
-        <w:t>Built checkout with server-validated pricing and atomic inventory reservations, retry-safe payment processing, and order management. Added end-to-end tests for price tampering, duplicate payments, and stock release.</w:t>
-      </w:r>
-    </w:p>
-    <w:p>
-      <w:pPr>
-        <w:pStyle w:val="Detail"/>
-      </w:pPr>
-      <w:r>
-        <w:t>Next.js, Stripe, Neon PostgreSQL, Drizzle, Cloudflare R2, Playwright</w:t>
       </w:r>
     </w:p>
     <w:p>

</xml_diff>

<commit_message>
fix: clarify resume experience and project descriptions
</commit_message>
<xml_diff>
--- a/public/Michael_Grier_Resume.docx
+++ b/public/Michael_Grier_Resume.docx
@@ -59,7 +59,7 @@
     </w:p>
     <w:p>
       <w:r>
-        <w:t>Full-stack software developer with five years at TransAlta building renewable-energy reporting tools and business process automation. Co-led a reporting and data-governance platform and maintained a wind, solar, and hydro operations app, working across React interfaces, APIs, databases, and Azure infrastructure. Independent projects include ecommerce, a native mobile app, and browser-based developer tools.</w:t>
+        <w:t>I'm a full-stack developer with five years at TransAlta building energy reporting and management applications and automating business processes. I focus on simple, easy to use interfaces and clear communication, drawing on my background in education. My independent projects include a custom ecommerce site, a native mobile app, and an interactive learning platform for developers.</w:t>
       </w:r>
     </w:p>
     <w:p>
@@ -76,6 +76,7 @@
     <w:p>
       <w:pPr>
         <w:pStyle w:val="Heading2"/>
+        <w:spacing w:before="80" w:after="40"/>
       </w:pPr>
       <w:r>
         <w:t>Software Developer</w:t>
@@ -94,7 +95,7 @@
         <w:pStyle w:val="Heading3"/>
       </w:pPr>
       <w:r>
-        <w:t>AthenaOS</w:t>
+        <w:t>Project: Athena</w:t>
       </w:r>
       <w:r>
         <w:rPr>
@@ -102,7 +103,7 @@
           <w:color w:val="5F5C57"/>
           <w:sz w:val="19"/>
         </w:rPr>
-        <w:t xml:space="preserve">  |  Production reporting and data governance</w:t>
+        <w:t xml:space="preserve">  |  Production reporting and data governance application</w:t>
       </w:r>
     </w:p>
     <w:p>
@@ -110,7 +111,7 @@
         <w:pStyle w:val="ListBullet"/>
       </w:pPr>
       <w:r>
-        <w:t>Co-led development of a Next.js and TypeScript platform that lets SQL-fluent analysts assemble wind and hydro reporting dashboards without writing React.</w:t>
+        <w:t>Co-led development of a Next.js and TypeScript production reporting platform with real-time dashboards for wind, hydro, solar, and natural gas management teams and senior leadership.</w:t>
       </w:r>
     </w:p>
     <w:p>
@@ -118,7 +119,15 @@
         <w:pStyle w:val="ListBullet"/>
       </w:pPr>
       <w:r>
-        <w:t>Built reusable ECharts cards and chart presets, plus a data-catalog workflow with draft submissions, multi-stage review, rework, and audit trails.</w:t>
+        <w:t>Enabled SQL-fluent analysts to create their own dashboards within the platform using reusable ECharts cards and chart presets.</w:t>
+      </w:r>
+    </w:p>
+    <w:p>
+      <w:pPr>
+        <w:pStyle w:val="ListBullet"/>
+      </w:pPr>
+      <w:r>
+        <w:t>Built a data-catalog workflow with draft submissions, multi-stage review, rework, and audit trails.</w:t>
       </w:r>
     </w:p>
     <w:p>
@@ -139,10 +148,18 @@
     </w:p>
     <w:p>
       <w:pPr>
+        <w:pStyle w:val="ListBullet"/>
+      </w:pPr>
+      <w:r>
+        <w:t>Worked with management teams, analysts, and data engineers to define reporting requirements, plan tasks, and refine fuel-specific dashboards through user feedback.</w:t>
+      </w:r>
+    </w:p>
+    <w:p>
+      <w:pPr>
         <w:pStyle w:val="Heading3"/>
       </w:pPr>
       <w:r>
-        <w:t>GenOS</w:t>
+        <w:t>Project: GenOS</w:t>
       </w:r>
       <w:r>
         <w:rPr>
@@ -150,7 +167,7 @@
           <w:color w:val="5F5C57"/>
           <w:sz w:val="19"/>
         </w:rPr>
-        <w:t xml:space="preserve">  |  Wind, solar, and hydro operations</w:t>
+        <w:t xml:space="preserve">  |  Wind, solar, hydro, and natural gas operations management application</w:t>
       </w:r>
     </w:p>
     <w:p>
@@ -180,6 +197,7 @@
     <w:p>
       <w:pPr>
         <w:pStyle w:val="Heading2"/>
+        <w:spacing w:before="80" w:after="40"/>
       </w:pPr>
       <w:r>
         <w:t>Junior Automation Developer</w:t>
@@ -195,12 +213,13 @@
     </w:p>
     <w:p>
       <w:r>
-        <w:t>Developed and maintained Blue Prism automations, from stakeholder requirements and reusable process components to testing, scheduled execution, and troubleshooting deployed bots.</w:t>
+        <w:t>Developed and maintained automations using Blue Prism and Python scripting. Translated stakeholder requirements into reusable process components and handled testing, scheduled execution, and production troubleshooting.</w:t>
       </w:r>
     </w:p>
     <w:p>
       <w:pPr>
         <w:pStyle w:val="Heading2"/>
+        <w:spacing w:before="80" w:after="40"/>
       </w:pPr>
       <w:r>
         <w:t>Freelance Software Developer</w:t>
@@ -222,6 +241,7 @@
     <w:p>
       <w:pPr>
         <w:pStyle w:val="Heading2"/>
+        <w:spacing w:before="80" w:after="40"/>
       </w:pPr>
       <w:r>
         <w:t>Frontend Web Developer Intern</w:t>

</xml_diff>

<commit_message>
chore: final copy pass and regenerated resume downloads
Rewrites the about, contact, and project copy in Michael's own voice, drops
the placeholder note on the personal paragraph, and makes the TransAlta
role description match what happened: one of two developers who wrote most
of the code, rather than co-leading. The resume content says the same, and
the Word and PDF downloads are rebuilt from it so all three agree.
</commit_message>
<xml_diff>
--- a/public/Michael_Grier_Resume.docx
+++ b/public/Michael_Grier_Resume.docx
@@ -59,7 +59,7 @@
     </w:p>
     <w:p>
       <w:r>
-        <w:t>I'm a full-stack developer with five years at TransAlta building energy reporting and management applications and automating business processes. I focus on simple, easy to use interfaces and clear communication, drawing on my background in education. My independent projects include a custom ecommerce site, a native mobile app, and an interactive learning platform for developers.</w:t>
+        <w:t>I'm a full-stack developer with five years of experience building reporting and management applications and automating business processes. I focus on simple, easy to use interfaces and clear communication, drawing on my background in education. My independent projects include a custom ecommerce site, a native mobile app, and an interactive learning platform for developers.</w:t>
       </w:r>
     </w:p>
     <w:p>
@@ -111,7 +111,7 @@
         <w:pStyle w:val="ListBullet"/>
       </w:pPr>
       <w:r>
-        <w:t>Co-led development of a Next.js and TypeScript production reporting platform with real-time dashboards for wind, hydro, solar, and natural gas management teams and senior leadership.</w:t>
+        <w:t>Contributed the majority of code to a Next.js and TypeScript production reporting platform with real-time dashboards for wind, hydro, solar, and natural gas management teams and senior leadership.</w:t>
       </w:r>
     </w:p>
     <w:p>

</xml_diff>

<commit_message>
feat: rewrite site copy and add project galleries (#8)
</commit_message>
<xml_diff>
--- a/public/Michael_Grier_Resume.docx
+++ b/public/Michael_Grier_Resume.docx
@@ -59,7 +59,7 @@
     </w:p>
     <w:p>
       <w:r>
-        <w:t>I'm a full-stack developer with five years at TransAlta building energy reporting and management applications and automating business processes. I focus on simple, easy to use interfaces and clear communication, drawing on my background in education. My independent projects include a custom ecommerce site, a native mobile app, and an interactive learning platform for developers.</w:t>
+        <w:t>I'm a full-stack developer with five years of experience building reporting and management applications and automating business processes. I focus on simple, easy to use interfaces and clear communication, drawing on my background in education. My independent projects include a custom ecommerce site, a native mobile app, and an interactive learning platform for developers.</w:t>
       </w:r>
     </w:p>
     <w:p>
@@ -111,7 +111,7 @@
         <w:pStyle w:val="ListBullet"/>
       </w:pPr>
       <w:r>
-        <w:t>Co-led development of a Next.js and TypeScript production reporting platform with real-time dashboards for wind, hydro, solar, and natural gas management teams and senior leadership.</w:t>
+        <w:t>Contributed the majority of code to a Next.js and TypeScript production reporting platform with real-time dashboards for wind, hydro, solar, and natural gas management teams and senior leadership.</w:t>
       </w:r>
     </w:p>
     <w:p>

</xml_diff>

<commit_message>
docs: add the website link to the resume downloads
</commit_message>
<xml_diff>
--- a/public/Michael_Grier_Resume.docx
+++ b/public/Michael_Grier_Resume.docx
@@ -54,6 +54,17 @@
             <w:color w:val="0078BF"/>
           </w:rPr>
           <w:t>github.com/michael-grier</w:t>
+        </w:r>
+      </w:hyperlink>
+      <w:r>
+        <w:t xml:space="preserve">  |  Website: </w:t>
+      </w:r>
+      <w:hyperlink r:id="rId11">
+        <w:r>
+          <w:rPr>
+            <w:color w:val="0078BF"/>
+          </w:rPr>
+          <w:t>michaelgrier.dev</w:t>
         </w:r>
       </w:hyperlink>
     </w:p>
@@ -285,7 +296,7 @@
         <w:pStyle w:val="Heading2"/>
         <w:spacing w:before="240" w:after="40"/>
       </w:pPr>
-      <w:hyperlink r:id="rId11">
+      <w:hyperlink r:id="rId12">
         <w:r>
           <w:rPr>
             <w:color w:val="0078BF"/>
@@ -321,7 +332,7 @@
         <w:pStyle w:val="Heading2"/>
         <w:spacing w:before="240" w:after="40"/>
       </w:pPr>
-      <w:hyperlink r:id="rId12">
+      <w:hyperlink r:id="rId13">
         <w:r>
           <w:rPr>
             <w:color w:val="0078BF"/>
@@ -357,7 +368,7 @@
         <w:pStyle w:val="Heading2"/>
         <w:spacing w:before="240" w:after="40"/>
       </w:pPr>
-      <w:hyperlink r:id="rId13">
+      <w:hyperlink r:id="rId14">
         <w:r>
           <w:rPr>
             <w:color w:val="0078BF"/>
@@ -515,10 +526,10 @@
       </w:r>
     </w:p>
     <w:sectPr>
-      <w:headerReference w:type="default" r:id="rId14"/>
-      <w:headerReference w:type="first" r:id="rId15"/>
-      <w:footerReference w:type="first" r:id="rId16"/>
-      <w:footerReference w:type="default" r:id="rId17"/>
+      <w:headerReference w:type="default" r:id="rId15"/>
+      <w:headerReference w:type="first" r:id="rId16"/>
+      <w:footerReference w:type="first" r:id="rId17"/>
+      <w:footerReference w:type="default" r:id="rId18"/>
       <w:pgSz w:w="12240" w:h="15840"/>
       <w:pgMar w:top="691" w:right="893" w:bottom="691" w:left="893" w:header="317" w:footer="317" w:gutter="0"/>
       <w:cols w:space="720"/>

</xml_diff>